<commit_message>
research: correct fertilizer mark-up (+1%) and sharpen Egypt/Morocco framing in ministerial note
Co-authored-by: arena-agent <297053741+arena-agent@users.noreply.github.com>
</commit_message>
<xml_diff>
--- a/research/cbam_algeria/Note_Concept_Ministre_MACF.docx
+++ b/research/cbam_algeria/Note_Concept_Ministre_MACF.docx
@@ -141,7 +141,7 @@
         <w:t>Fait n°3 — Nous sommes le seul grand exportateur méditerranéen sans aucune capacité de vérification.</w:t>
       </w:r>
       <w:r>
-        <w:t xml:space="preserve"> Aucun organisme algérien n’est accrédité ISO 14065 (ALGERAC n’a pas ce périmètre). Aucun grand vérificateur européen n’a de bureau GES en Algérie (leurs filiales locales font de l’inspection et de la certification ISO classique). L’Égypte compte 4 organismes accrédités, le Maroc a voté une loi et confié un mandat carbone à l’IMANOR en 2025. L’Algérie : zéro.</w:t>
+        <w:t xml:space="preserve"> Aucun organisme algérien n’est accrédité ISO 14065 (ALGERAC n’a pas ce périmètre). Aucun grand vérificateur européen n’a de bureau GES en Algérie (leurs filiales locales font de l’inspection et de la certification ISO classique). L’Égypte compte 4 organismes accrédités ISO 14065 et un vivier d’auditeurs que les vérificateurs européens recrutent déjà ; le Maroc a voté une loi (2025) confiant à l’IMANOR un mandat carbone — sans capacité de vérification MACF effective à ce jour, mais avec une position affirmée face à Bruxelles. L’Algérie : ni cadre, ni auditeurs, ni discours.</w:t>
       </w:r>
     </w:p>
     <w:tbl>
@@ -167,7 +167,7 @@
                 <w:color w:val="B01C1C"/>
                 <w:sz w:val="22"/>
               </w:rPr>
-              <w:t>Conséquence mécanique : sans vérification, nos exportateurs sont taxés sur des « valeurs par défaut » majorées — +10 % en 2026, +20 % en 2027, +30 % à partir de 2028 pour l’acier et le ciment — sans aucune déduction, car l’Algérie n’a pas de prix carbone national reconnu. Nous payons pour des émissions que nous n’avons pas émises.</w:t>
+              <w:t>Conséquence mécanique : sans vérification, nos exportateurs sont taxés sur des « valeurs par défaut » majorées — +10 % en 2026, +20 % en 2027, +30 % à partir de 2028 pour l’acier et le ciment (+1 % pour les engrais) — sans aucune déduction, car l’Algérie n’a pas de prix carbone national reconnu. Ce n’est pas une perte d’exportations : c’est une hémorragie de marge, captée par les importateurs européens sous forme de rabais, sur des émissions que nous n’avons pas émises.</w:t>
             </w:r>
           </w:p>
         </w:tc>
@@ -349,7 +349,7 @@
               <w:rPr>
                 <w:sz w:val="18"/>
               </w:rPr>
-              <w:t>2,10 t CO₂/t (défaut 2026, Argus)</w:t>
+              <w:t>2,10 t CO₂/t (défaut 2026, Argus) — majoration engrais : +1 % seulement</w:t>
             </w:r>
           </w:p>
         </w:tc>
@@ -435,7 +435,7 @@
               <w:rPr>
                 <w:sz w:val="18"/>
               </w:rPr>
-              <w:t>≈ 45 €/t de charge par défaut (Argus)</w:t>
+              <w:t>≈ 45 €/t de charge par défaut (Argus) — majoration +1 %</w:t>
             </w:r>
           </w:p>
         </w:tc>
@@ -697,7 +697,7 @@
                 <w:color w:val="B01C1C"/>
                 <w:sz w:val="22"/>
               </w:rPr>
-              <w:t>Ordre de grandeur : 140 à 230 millions d’euros par an de coût carbone évitable — payé aujourd’hui par nos exportateurs sous forme de rabais imposés par leurs acheteurs européens, ou perdu en parts de marché. Ce montant DOUBLE presque d’ici 2028 avec la majoration à 30 %. Le coût total d’un programme national de vérification représente moins de 1 % de cette somme.</w:t>
+              <w:t>Ordre de grandeur : 140 à 230 millions d’euros par an de coût carbone évitable — dont près des trois quarts sur l’acier et le clinker, où l’écart entre défaut et réel est le plus large et où la majoration grimpe à +30 % en 2028. Payé aujourd’hui par nos exportateurs sous forme de rabais imposés par leurs acheteurs européens, ou perdu en parts de marché. Le coût total d’un programme national de vérification représente moins de 1 % de cette somme.</w:t>
             </w:r>
           </w:p>
         </w:tc>

</xml_diff>

<commit_message>
research: add OSINT intelligence dossier (partner due diligence, regulators, competitors, installations); anonymise partner in ministerial note
Co-authored-by: arena-agent <297053741+arena-agent@users.noreply.github.com>
</commit_message>
<xml_diff>
--- a/research/cbam_algeria/Note_Concept_Ministre_MACF.docx
+++ b/research/cbam_algeria/Note_Concept_Ministre_MACF.docx
@@ -1135,7 +1135,7 @@
               <w:rPr>
                 <w:sz w:val="18"/>
               </w:rPr>
-              <w:t>Véhicule labellisé start-up : diagnostic de préparation MACF, collecte et structuration des données d’émissions, plateforme numérique de suivi installation → importateur. Opère sous supervision d’un organisme de vérification européen accrédité (partenaire identifié : Green and Fair JSC, Bulgarie, accrédité EU ETS depuis 2008, en cours d’extension MACF).</w:t>
+              <w:t>Véhicule labellisé start-up : diagnostic de préparation MACF, collecte et structuration des données d’émissions, plateforme numérique de suivi installation → importateur. Opère sous supervision d’un organisme de vérification européen accrédité (partenaire européen accrédité EU ETS depuis plus de quinze ans, en cours de contractualisation et d’extension de périmètre MACF).</w:t>
             </w:r>
           </w:p>
         </w:tc>
@@ -1349,7 +1349,7 @@
         <w:t>Un partenaire vérifié, pas une promesse.</w:t>
       </w:r>
       <w:r>
-        <w:t xml:space="preserve"> Un partenaire européen déjà accrédité ETS depuis 18 ans, auditable sur le registre public de l’organisme bulgare d’accréditation (certificat n° 12 ОВ), prêt à former et superviser des auditeurs algériens — au lieu d’attendre que les grands groupes envoient leurs propres équipes et facturent en conséquence.</w:t>
+        <w:t xml:space="preserve"> Un partenaire européen déjà accrédité ETS depuis plus de quinze ans, vérifiable sur le registre public de son organisme national d’accréditation, prêt à former et superviser des auditeurs algériens — au lieu d’attendre que les grands groupes envoient leurs propres équipes et facturent en conséquence.</w:t>
       </w:r>
     </w:p>
     <w:p>
@@ -1730,7 +1730,7 @@
           <w:color w:val="555555"/>
           <w:sz w:val="15"/>
         </w:rPr>
-        <w:t>Sources : Commission européenne (Règlement (UE) 2023/956 ; IR (UE) 2025/2546, 2025/2547, 2025/2621 ; DR (UE) 2025/2551) · Argus Media, valeurs par défaut ammoniac/urée Algérie, déc. 2025 · ICEX/ITC fiche-pays Algérie 2026 · Ministère du Commerce extérieur (exportations hors hydrocarbures 2025) · Registre BAS (nab-bas.bg) · NUPI Policy Brief 2026/2 (Maroc) · Carbon Pulse (loi marocaine, juin 2025) · Liste ALGERAC des organismes accrédités (juillet 2026) · GMK Center (sidérurgie algérienne, 2026) · APS (exportations clinker Chlef 2025). Les volumes et écarts d’émissions sont des estimations à partir de sources publiques, à valider avec les opérateurs.</w:t>
+        <w:t>Sources : Commission européenne (Règlement (UE) 2023/956 ; IR (UE) 2025/2546, 2025/2547, 2025/2621 ; DR (UE) 2025/2551) · Argus Media, valeurs par défaut ammoniac/urée Algérie, déc. 2025 · ICEX/ITC fiche-pays Algérie 2026 · Ministère du Commerce extérieur (exportations hors hydrocarbures 2025) · NUPI Policy Brief 2026/2 (Maroc) · Carbon Pulse (loi marocaine, juin 2025) · Liste ALGERAC des organismes accrédités (juillet 2026) · GMK Center (sidérurgie algérienne, 2026) · APS (exportations clinker Chlef 2025). Les volumes et écarts d’émissions sont des estimations à partir de sources publiques, à valider avec les opérateurs.</w:t>
       </w:r>
     </w:p>
     <w:sectPr>

</xml_diff>